<commit_message>
Update cast and admin guides with newer content and structure
Cast guide:
- Add welcome intro and 'How to Use Bot Commands' section
- Add Meeting Reminders & RSVPs as section 1
- Add 'What the bot does automatically' framing for meetings, check-in, and coverage
- Coverage section notes daily reminders and manager notification
- Fix cancel description: post is updated (not deleted)
- Renumber all sections to accommodate new additions
- Update build script to match; add steps4 numbering ref

Admin guide:
- Add late-booking notifications subsection under Schedule & Shift Reminders
- Expand Coverage section: add /open-coverage, /set-coverage-manager, confirming coverage flow
- Add Section 8: Cleanup (/purge) with detail table
- Update command reference to full set (was missing purge, open-coverage, cancel-coverage-request, set-coverage-manager)
- Rebuild both docx files
</commit_message>
<xml_diff>
--- a/docs/admin-guide.docx
+++ b/docs/admin-guide.docx
@@ -673,6 +673,58 @@
           <w:sz w:val="24"/>
           <w:szCs w:val="24"/>
         </w:rPr>
+        <w:t xml:space="preserve">Set coverage manager</w:t>
+      </w:r>
+    </w:p>
+    <w:p>
+      <w:pPr>
+        <w:spacing w:after="80" w:before="80"/>
+      </w:pPr>
+      <w:r>
+        <w:rPr>
+          <w:rFonts w:ascii="Arial" w:cs="Arial" w:eastAsia="Arial" w:hAnsi="Arial"/>
+          <w:sz w:val="24"/>
+          <w:szCs w:val="24"/>
+        </w:rPr>
+        <w:t xml:space="preserve">Use </w:t>
+      </w:r>
+      <w:r>
+        <w:rPr>
+          <w:rFonts w:ascii="Courier New" w:cs="Courier New" w:eastAsia="Courier New" w:hAnsi="Courier New"/>
+          <w:color w:val="333333"/>
+          <w:sz w:val="22"/>
+          <w:szCs w:val="22"/>
+        </w:rPr>
+        <w:t xml:space="preserve">/set-coverage-manager</w:t>
+      </w:r>
+      <w:r>
+        <w:rPr>
+          <w:rFonts w:ascii="Arial" w:cs="Arial" w:eastAsia="Arial" w:hAnsi="Arial"/>
+          <w:sz w:val="24"/>
+          <w:szCs w:val="24"/>
+        </w:rPr>
+        <w:t xml:space="preserve"> to designate who receives fillable-shift DMs and the nightly EOD coverage summary.</w:t>
+      </w:r>
+    </w:p>
+    <w:p>
+      <w:pPr>
+        <w:spacing w:after="0" w:before="80"/>
+      </w:pPr>
+    </w:p>
+    <w:p>
+      <w:pPr>
+        <w:pStyle w:val="Heading2"/>
+        <w:spacing w:after="60" w:before="200"/>
+      </w:pPr>
+      <w:r>
+        <w:rPr>
+          <w:rFonts w:ascii="Arial" w:cs="Arial" w:eastAsia="Arial" w:hAnsi="Arial"/>
+          <w:b/>
+          <w:bCs/>
+          <w:color w:val="333333"/>
+          <w:sz w:val="24"/>
+          <w:szCs w:val="24"/>
+        </w:rPr>
         <w:t xml:space="preserve">Set check-in alert channels</w:t>
       </w:r>
     </w:p>
@@ -1163,38 +1215,26 @@
     </w:p>
     <w:p>
       <w:pPr>
+        <w:spacing w:after="0" w:before="80"/>
+      </w:pPr>
+    </w:p>
+    <w:p>
+      <w:pPr>
+        <w:spacing w:after="80" w:before="80"/>
+      </w:pPr>
+      <w:r>
+        <w:rPr>
+          <w:rFonts w:ascii="Arial" w:cs="Arial" w:eastAsia="Arial" w:hAnsi="Arial"/>
+          <w:sz w:val="24"/>
+          <w:szCs w:val="24"/>
+        </w:rPr>
+        <w:t xml:space="preserve">The initial post is the only one with RSVP reactions (✅ ❌ ❓). The 7-day and 24-hour reminders @mention anyone who has already RSVP’d ✅ or ❓, and link back to the original post.</w:t>
+      </w:r>
+    </w:p>
+    <w:p>
+      <w:pPr>
         <w:spacing w:after="0" w:before="100"/>
       </w:pPr>
-    </w:p>
-    <w:p>
-      <w:pPr>
-        <w:pStyle w:val="Heading2"/>
-        <w:spacing w:after="60" w:before="200"/>
-      </w:pPr>
-      <w:r>
-        <w:rPr>
-          <w:rFonts w:ascii="Arial" w:cs="Arial" w:eastAsia="Arial" w:hAnsi="Arial"/>
-          <w:b/>
-          <w:bCs/>
-          <w:color w:val="333333"/>
-          <w:sz w:val="24"/>
-          <w:szCs w:val="24"/>
-        </w:rPr>
-        <w:t xml:space="preserve">How reminders work</w:t>
-      </w:r>
-    </w:p>
-    <w:p>
-      <w:pPr>
-        <w:spacing w:after="80" w:before="80"/>
-      </w:pPr>
-      <w:r>
-        <w:rPr>
-          <w:rFonts w:ascii="Arial" w:cs="Arial" w:eastAsia="Arial" w:hAnsi="Arial"/>
-          <w:sz w:val="24"/>
-          <w:szCs w:val="24"/>
-        </w:rPr>
-        <w:t xml:space="preserve">The initial “just scheduled” post is the only one with RSVP reactions (✅ ❌ ❓). The 7-day and 24-hour follow-up reminders @mention anyone who has already RSVP’d ✅ or ❓, and include a link back to the original post. Cast members only need to RSVP once on the original post.</w:t>
-      </w:r>
     </w:p>
     <w:p>
       <w:pPr>
@@ -1264,7 +1304,7 @@
           <w:sz w:val="24"/>
           <w:szCs w:val="24"/>
         </w:rPr>
-        <w:t xml:space="preserve"> — change title, date (one-time only), time, duration, or channel. Any 7-day and 24-hour reminder posts that have already been sent are updated with the new details and a refreshed attendee list.</w:t>
+        <w:t xml:space="preserve"> — change title, date (one-time only), time, duration, or channel. Existing reminder posts are updated with the new details.</w:t>
       </w:r>
     </w:p>
     <w:p>
@@ -1291,7 +1331,7 @@
           <w:sz w:val="24"/>
           <w:szCs w:val="24"/>
         </w:rPr>
-        <w:t xml:space="preserve"> — deactivates the meeting, edits the original reminder post to show the meeting is cancelled (with strikethrough title), and posts a cancellation notice in the channel with a link back to the original post.</w:t>
+        <w:t xml:space="preserve"> — deactivates the meeting and posts a cancellation notice to the channel.</w:t>
       </w:r>
     </w:p>
     <w:p>
@@ -1514,28 +1554,43 @@
     </w:p>
     <w:p>
       <w:pPr>
-        <w:pBdr>
-          <w:bottom w:val="single" w:color="CCCCCC" w:sz="4" w:space="1"/>
-        </w:pBdr>
-        <w:spacing w:after="160" w:before="160"/>
-      </w:pPr>
-    </w:p>
-    <w:p>
-      <w:pPr>
-        <w:pStyle w:val="Heading1"/>
-        <w:spacing w:after="100" w:before="320"/>
+        <w:spacing w:after="0" w:before="120"/>
+      </w:pPr>
+    </w:p>
+    <w:p>
+      <w:pPr>
+        <w:pStyle w:val="Heading2"/>
+        <w:spacing w:after="60" w:before="200"/>
       </w:pPr>
       <w:r>
         <w:rPr>
           <w:rFonts w:ascii="Arial" w:cs="Arial" w:eastAsia="Arial" w:hAnsi="Arial"/>
           <w:b/>
           <w:bCs/>
-          <w:color w:val="2E5FA3"/>
-          <w:sz w:val="30"/>
-          <w:szCs w:val="30"/>
-        </w:rPr>
-        <w:t xml:space="preserve">5. Coverage Requests</w:t>
-      </w:r>
+          <w:color w:val="333333"/>
+          <w:sz w:val="24"/>
+          <w:szCs w:val="24"/>
+        </w:rPr>
+        <w:t xml:space="preserve">Late-Booking Notifications (automatic)</w:t>
+      </w:r>
+    </w:p>
+    <w:p>
+      <w:pPr>
+        <w:spacing w:after="80" w:before="80"/>
+      </w:pPr>
+      <w:r>
+        <w:rPr>
+          <w:rFonts w:ascii="Arial" w:cs="Arial" w:eastAsia="Arial" w:hAnsi="Arial"/>
+          <w:sz w:val="24"/>
+          <w:szCs w:val="24"/>
+        </w:rPr>
+        <w:t xml:space="preserve">When a show has no audience bookings at 8:48am, the bot monitors for last-minute bookings and DMs assigned cast as soon as possible — no admin action required.</w:t>
+      </w:r>
+    </w:p>
+    <w:p>
+      <w:pPr>
+        <w:spacing w:after="0" w:before="80"/>
+      </w:pPr>
     </w:p>
     <w:p>
       <w:pPr>
@@ -1548,20 +1603,11 @@
       </w:pPr>
       <w:r>
         <w:rPr>
-          <w:rFonts w:ascii="Courier New" w:cs="Courier New" w:eastAsia="Courier New" w:hAnsi="Courier New"/>
-          <w:color w:val="333333"/>
-          <w:sz w:val="22"/>
-          <w:szCs w:val="22"/>
-        </w:rPr>
-        <w:t xml:space="preserve">/custom-game show:X date:X channel:#X</w:t>
-      </w:r>
-      <w:r>
-        <w:rPr>
-          <w:rFonts w:ascii="Arial" w:cs="Arial" w:eastAsia="Arial" w:hAnsi="Arial"/>
-          <w:sz w:val="24"/>
-          <w:szCs w:val="24"/>
-        </w:rPr>
-        <w:t xml:space="preserve"> — posts a custom game availability check. The bot replies with a Game ID.</w:t>
+          <w:rFonts w:ascii="Arial" w:cs="Arial" w:eastAsia="Arial" w:hAnsi="Arial"/>
+          <w:sz w:val="24"/>
+          <w:szCs w:val="24"/>
+        </w:rPr>
+        <w:t xml:space="preserve">At 8:48am, records any shows with zero bookings.</w:t>
       </w:r>
     </w:p>
     <w:p>
@@ -1575,20 +1621,11 @@
       </w:pPr>
       <w:r>
         <w:rPr>
-          <w:rFonts w:ascii="Courier New" w:cs="Courier New" w:eastAsia="Courier New" w:hAnsi="Courier New"/>
-          <w:color w:val="333333"/>
-          <w:sz w:val="22"/>
-          <w:szCs w:val="22"/>
-        </w:rPr>
-        <w:t xml:space="preserve">/cancel-custom-game game_id:N</w:t>
-      </w:r>
-      <w:r>
-        <w:rPr>
-          <w:rFonts w:ascii="Arial" w:cs="Arial" w:eastAsia="Arial" w:hAnsi="Arial"/>
-          <w:sz w:val="24"/>
-          <w:szCs w:val="24"/>
-        </w:rPr>
-        <w:t xml:space="preserve"> — deletes the post. Get the ID from the post itself.</w:t>
+          <w:rFonts w:ascii="Arial" w:cs="Arial" w:eastAsia="Arial" w:hAnsi="Arial"/>
+          <w:sz w:val="24"/>
+          <w:szCs w:val="24"/>
+        </w:rPr>
+        <w:t xml:space="preserve">Schedules a check 110 minutes before each blank show’s start time (bookings close 120 min before curtain).</w:t>
       </w:r>
     </w:p>
     <w:p>
@@ -1602,20 +1639,11 @@
       </w:pPr>
       <w:r>
         <w:rPr>
-          <w:rFonts w:ascii="Courier New" w:cs="Courier New" w:eastAsia="Courier New" w:hAnsi="Courier New"/>
-          <w:color w:val="333333"/>
-          <w:sz w:val="22"/>
-          <w:szCs w:val="22"/>
-        </w:rPr>
-        <w:t xml:space="preserve">/set-coverage-channel</w:t>
-      </w:r>
-      <w:r>
-        <w:rPr>
-          <w:rFonts w:ascii="Arial" w:cs="Arial" w:eastAsia="Arial" w:hAnsi="Arial"/>
-          <w:sz w:val="24"/>
-          <w:szCs w:val="24"/>
-        </w:rPr>
-        <w:t xml:space="preserve"> — configure where coverage requests go. See First-Time Setup.</w:t>
+          <w:rFonts w:ascii="Arial" w:cs="Arial" w:eastAsia="Arial" w:hAnsi="Arial"/>
+          <w:sz w:val="24"/>
+          <w:szCs w:val="24"/>
+        </w:rPr>
+        <w:t xml:space="preserve">When the timer fires, re-checks Bookeo and DMs every assigned cast member if the show now has bookings.</w:t>
       </w:r>
     </w:p>
     <w:p>
@@ -1629,20 +1657,11 @@
       </w:pPr>
       <w:r>
         <w:rPr>
-          <w:rFonts w:ascii="Courier New" w:cs="Courier New" w:eastAsia="Courier New" w:hAnsi="Courier New"/>
-          <w:color w:val="333333"/>
-          <w:sz w:val="22"/>
-          <w:szCs w:val="22"/>
-        </w:rPr>
-        <w:t xml:space="preserve">/list-coverage-channels</w:t>
-      </w:r>
-      <w:r>
-        <w:rPr>
-          <w:rFonts w:ascii="Arial" w:cs="Arial" w:eastAsia="Arial" w:hAnsi="Arial"/>
-          <w:sz w:val="24"/>
-          <w:szCs w:val="24"/>
-        </w:rPr>
-        <w:t xml:space="preserve"> — shows current channel assignments for all shows.</w:t>
+          <w:rFonts w:ascii="Arial" w:cs="Arial" w:eastAsia="Arial" w:hAnsi="Arial"/>
+          <w:sz w:val="24"/>
+          <w:szCs w:val="24"/>
+        </w:rPr>
+        <w:t xml:space="preserve">Restart recovery: unnotified baseline rows reschedule automatically on bot startup.</w:t>
       </w:r>
     </w:p>
     <w:p>
@@ -1667,26 +1686,25 @@
           <w:sz w:val="30"/>
           <w:szCs w:val="30"/>
         </w:rPr>
-        <w:t xml:space="preserve">6. Check-in Monitoring</w:t>
-      </w:r>
-    </w:p>
-    <w:p>
-      <w:pPr>
-        <w:spacing w:after="80" w:before="80"/>
-      </w:pPr>
-      <w:r>
-        <w:rPr>
-          <w:rFonts w:ascii="Arial" w:cs="Arial" w:eastAsia="Arial" w:hAnsi="Arial"/>
-          <w:sz w:val="24"/>
-          <w:szCs w:val="24"/>
-        </w:rPr>
-        <w:t xml:space="preserve">The bot seeds check-in records from Bookeo each morning and fires alerts at call time for cast members who haven’t checked in.</w:t>
-      </w:r>
-    </w:p>
-    <w:p>
-      <w:pPr>
-        <w:spacing w:after="0" w:before="80"/>
-      </w:pPr>
+        <w:t xml:space="preserve">5. Coverage Requests</w:t>
+      </w:r>
+    </w:p>
+    <w:p>
+      <w:pPr>
+        <w:pStyle w:val="Heading2"/>
+        <w:spacing w:after="60" w:before="200"/>
+      </w:pPr>
+      <w:r>
+        <w:rPr>
+          <w:rFonts w:ascii="Arial" w:cs="Arial" w:eastAsia="Arial" w:hAnsi="Arial"/>
+          <w:b/>
+          <w:bCs/>
+          <w:color w:val="333333"/>
+          <w:sz w:val="24"/>
+          <w:szCs w:val="24"/>
+        </w:rPr>
+        <w:t xml:space="preserve">Custom Games</w:t>
+      </w:r>
     </w:p>
     <w:p>
       <w:pPr>
@@ -1704,15 +1722,15 @@
           <w:sz w:val="22"/>
           <w:szCs w:val="22"/>
         </w:rPr>
-        <w:t xml:space="preserve">/checkin-status</w:t>
-      </w:r>
-      <w:r>
-        <w:rPr>
-          <w:rFonts w:ascii="Arial" w:cs="Arial" w:eastAsia="Arial" w:hAnsi="Arial"/>
-          <w:sz w:val="24"/>
-          <w:szCs w:val="24"/>
-        </w:rPr>
-        <w:t xml:space="preserve"> — shows check-in records for the last 3 days. States: checked in, alert fired, missed (bug), or pending.</w:t>
+        <w:t xml:space="preserve">/custom-game show:X date:X channel:#X</w:t>
+      </w:r>
+      <w:r>
+        <w:rPr>
+          <w:rFonts w:ascii="Arial" w:cs="Arial" w:eastAsia="Arial" w:hAnsi="Arial"/>
+          <w:sz w:val="24"/>
+          <w:szCs w:val="24"/>
+        </w:rPr>
+        <w:t xml:space="preserve"> — posts a custom game availability check. The bot replies with a Game ID.</w:t>
       </w:r>
     </w:p>
     <w:p>
@@ -1731,15 +1749,50 @@
           <w:sz w:val="22"/>
           <w:szCs w:val="22"/>
         </w:rPr>
-        <w:t xml:space="preserve">/force-checkin user:@User</w:t>
-      </w:r>
-      <w:r>
-        <w:rPr>
-          <w:rFonts w:ascii="Arial" w:cs="Arial" w:eastAsia="Arial" w:hAnsi="Arial"/>
-          <w:sz w:val="24"/>
-          <w:szCs w:val="24"/>
-        </w:rPr>
-        <w:t xml:space="preserve"> — manually marks a cast member as checked in. Add </w:t>
+        <w:t xml:space="preserve">/cancel-custom-game game_id:N</w:t>
+      </w:r>
+      <w:r>
+        <w:rPr>
+          <w:rFonts w:ascii="Arial" w:cs="Arial" w:eastAsia="Arial" w:hAnsi="Arial"/>
+          <w:sz w:val="24"/>
+          <w:szCs w:val="24"/>
+        </w:rPr>
+        <w:t xml:space="preserve"> — cancels the game and deletes its post. Get the ID from the post itself.</w:t>
+      </w:r>
+    </w:p>
+    <w:p>
+      <w:pPr>
+        <w:spacing w:after="0" w:before="120"/>
+      </w:pPr>
+    </w:p>
+    <w:p>
+      <w:pPr>
+        <w:pStyle w:val="Heading2"/>
+        <w:spacing w:after="60" w:before="200"/>
+      </w:pPr>
+      <w:r>
+        <w:rPr>
+          <w:rFonts w:ascii="Arial" w:cs="Arial" w:eastAsia="Arial" w:hAnsi="Arial"/>
+          <w:b/>
+          <w:bCs/>
+          <w:color w:val="333333"/>
+          <w:sz w:val="24"/>
+          <w:szCs w:val="24"/>
+        </w:rPr>
+        <w:t xml:space="preserve">Coverage Requests</w:t>
+      </w:r>
+    </w:p>
+    <w:p>
+      <w:pPr>
+        <w:spacing w:after="80" w:before="80"/>
+      </w:pPr>
+      <w:r>
+        <w:rPr>
+          <w:rFonts w:ascii="Arial" w:cs="Arial" w:eastAsia="Arial" w:hAnsi="Arial"/>
+          <w:sz w:val="24"/>
+          <w:szCs w:val="24"/>
+        </w:rPr>
+        <w:t xml:space="preserve">Coverage requests are posted by cast members via </w:t>
       </w:r>
       <w:r>
         <w:rPr>
@@ -1748,134 +1801,21 @@
           <w:sz w:val="22"/>
           <w:szCs w:val="22"/>
         </w:rPr>
-        <w:t xml:space="preserve">show:X</w:t>
-      </w:r>
-      <w:r>
-        <w:rPr>
-          <w:rFonts w:ascii="Arial" w:cs="Arial" w:eastAsia="Arial" w:hAnsi="Arial"/>
-          <w:sz w:val="24"/>
-          <w:szCs w:val="24"/>
-        </w:rPr>
-        <w:t xml:space="preserve"> if they have multiple shifts today.</w:t>
+        <w:t xml:space="preserve">/coverage-request</w:t>
+      </w:r>
+      <w:r>
+        <w:rPr>
+          <w:rFonts w:ascii="Arial" w:cs="Arial" w:eastAsia="Arial" w:hAnsi="Arial"/>
+          <w:sz w:val="24"/>
+          <w:szCs w:val="24"/>
+        </w:rPr>
+        <w:t xml:space="preserve">. Each requested date/time becomes its own shift post with a unique Shift ID at the bottom.</w:t>
       </w:r>
     </w:p>
     <w:p>
       <w:pPr>
         <w:spacing w:after="0" w:before="80"/>
       </w:pPr>
-    </w:p>
-    <w:p>
-      <w:pPr>
-        <w:spacing w:after="80" w:before="80"/>
-      </w:pPr>
-      <w:r>
-        <w:rPr>
-          <w:rFonts w:ascii="Arial" w:cs="Arial" w:eastAsia="Arial" w:hAnsi="Arial"/>
-          <w:b/>
-          <w:bCs/>
-          <w:sz w:val="24"/>
-          <w:szCs w:val="24"/>
-        </w:rPr>
-        <w:t xml:space="preserve">Managing alert contacts: </w:t>
-      </w:r>
-      <w:r>
-        <w:rPr>
-          <w:rFonts w:ascii="Courier New" w:cs="Courier New" w:eastAsia="Courier New" w:hAnsi="Courier New"/>
-          <w:color w:val="333333"/>
-          <w:sz w:val="22"/>
-          <w:szCs w:val="22"/>
-        </w:rPr>
-        <w:t xml:space="preserve">/add-checkin-contact</w:t>
-      </w:r>
-      <w:r>
-        <w:rPr>
-          <w:rFonts w:ascii="Arial" w:cs="Arial" w:eastAsia="Arial" w:hAnsi="Arial"/>
-          <w:sz w:val="24"/>
-          <w:szCs w:val="24"/>
-        </w:rPr>
-        <w:t xml:space="preserve">, </w:t>
-      </w:r>
-      <w:r>
-        <w:rPr>
-          <w:rFonts w:ascii="Courier New" w:cs="Courier New" w:eastAsia="Courier New" w:hAnsi="Courier New"/>
-          <w:color w:val="333333"/>
-          <w:sz w:val="22"/>
-          <w:szCs w:val="22"/>
-        </w:rPr>
-        <w:t xml:space="preserve">/remove-checkin-contact</w:t>
-      </w:r>
-      <w:r>
-        <w:rPr>
-          <w:rFonts w:ascii="Arial" w:cs="Arial" w:eastAsia="Arial" w:hAnsi="Arial"/>
-          <w:sz w:val="24"/>
-          <w:szCs w:val="24"/>
-        </w:rPr>
-        <w:t xml:space="preserve">, </w:t>
-      </w:r>
-      <w:r>
-        <w:rPr>
-          <w:rFonts w:ascii="Courier New" w:cs="Courier New" w:eastAsia="Courier New" w:hAnsi="Courier New"/>
-          <w:color w:val="333333"/>
-          <w:sz w:val="22"/>
-          <w:szCs w:val="22"/>
-        </w:rPr>
-        <w:t xml:space="preserve">/list-checkin-contacts</w:t>
-      </w:r>
-      <w:r>
-        <w:rPr>
-          <w:rFonts w:ascii="Arial" w:cs="Arial" w:eastAsia="Arial" w:hAnsi="Arial"/>
-          <w:sz w:val="24"/>
-          <w:szCs w:val="24"/>
-        </w:rPr>
-        <w:t xml:space="preserve">.</w:t>
-      </w:r>
-    </w:p>
-    <w:p>
-      <w:pPr>
-        <w:pBdr>
-          <w:bottom w:val="single" w:color="CCCCCC" w:sz="4" w:space="1"/>
-        </w:pBdr>
-        <w:spacing w:after="160" w:before="160"/>
-      </w:pPr>
-    </w:p>
-    <w:p>
-      <w:pPr>
-        <w:pStyle w:val="Heading1"/>
-        <w:spacing w:after="100" w:before="320"/>
-      </w:pPr>
-      <w:r>
-        <w:rPr>
-          <w:rFonts w:ascii="Arial" w:cs="Arial" w:eastAsia="Arial" w:hAnsi="Arial"/>
-          <w:b/>
-          <w:bCs/>
-          <w:color w:val="2E5FA3"/>
-          <w:sz w:val="30"/>
-          <w:szCs w:val="30"/>
-        </w:rPr>
-        <w:t xml:space="preserve">7. Bot Settings</w:t>
-      </w:r>
-    </w:p>
-    <w:p>
-      <w:pPr>
-        <w:spacing w:after="80" w:before="80"/>
-      </w:pPr>
-      <w:r>
-        <w:rPr>
-          <w:rFonts w:ascii="Courier New" w:cs="Courier New" w:eastAsia="Courier New" w:hAnsi="Courier New"/>
-          <w:color w:val="333333"/>
-          <w:sz w:val="22"/>
-          <w:szCs w:val="22"/>
-        </w:rPr>
-        <w:t xml:space="preserve">/bot-config setting:X value:On|Off</w:t>
-      </w:r>
-      <w:r>
-        <w:rPr>
-          <w:rFonts w:ascii="Arial" w:cs="Arial" w:eastAsia="Arial" w:hAnsi="Arial"/>
-          <w:sz w:val="24"/>
-          <w:szCs w:val="24"/>
-        </w:rPr>
-        <w:t xml:space="preserve"> — toggle automated shift DMs.</w:t>
-      </w:r>
     </w:p>
     <w:p>
       <w:pPr>
@@ -1888,21 +1828,20 @@
       </w:pPr>
       <w:r>
         <w:rPr>
-          <w:rFonts w:ascii="Arial" w:cs="Arial" w:eastAsia="Arial" w:hAnsi="Arial"/>
-          <w:b/>
-          <w:bCs/>
-          <w:sz w:val="24"/>
-          <w:szCs w:val="24"/>
-        </w:rPr>
-        <w:t xml:space="preserve">Weekly shift DMs</w:t>
-      </w:r>
-      <w:r>
-        <w:rPr>
-          <w:rFonts w:ascii="Arial" w:cs="Arial" w:eastAsia="Arial" w:hAnsi="Arial"/>
-          <w:sz w:val="24"/>
-          <w:szCs w:val="24"/>
-        </w:rPr>
-        <w:t xml:space="preserve"> — Sunday DMs covering the next 7 days.</w:t>
+          <w:rFonts w:ascii="Courier New" w:cs="Courier New" w:eastAsia="Courier New" w:hAnsi="Courier New"/>
+          <w:color w:val="333333"/>
+          <w:sz w:val="22"/>
+          <w:szCs w:val="22"/>
+        </w:rPr>
+        <w:t xml:space="preserve">/cancel-coverage-request request_id:N</w:t>
+      </w:r>
+      <w:r>
+        <w:rPr>
+          <w:rFonts w:ascii="Arial" w:cs="Arial" w:eastAsia="Arial" w:hAnsi="Arial"/>
+          <w:sz w:val="24"/>
+          <w:szCs w:val="24"/>
+        </w:rPr>
+        <w:t xml:space="preserve"> — cancels a single shift. The post updates to show it’s cancelled (not deleted). If it was the last shift, the header post is also updated.</w:t>
       </w:r>
     </w:p>
     <w:p>
@@ -1916,21 +1855,240 @@
       </w:pPr>
       <w:r>
         <w:rPr>
+          <w:rFonts w:ascii="Courier New" w:cs="Courier New" w:eastAsia="Courier New" w:hAnsi="Courier New"/>
+          <w:color w:val="333333"/>
+          <w:sz w:val="22"/>
+          <w:szCs w:val="22"/>
+        </w:rPr>
+        <w:t xml:space="preserve">/open-coverage</w:t>
+      </w:r>
+      <w:r>
+        <w:rPr>
+          <w:rFonts w:ascii="Arial" w:cs="Arial" w:eastAsia="Arial" w:hAnsi="Arial"/>
+          <w:sz w:val="24"/>
+          <w:szCs w:val="24"/>
+        </w:rPr>
+        <w:t xml:space="preserve"> — lists all open shifts and custom games in one private view, with Cancel and Confirm buttons next to each item.</w:t>
+      </w:r>
+    </w:p>
+    <w:p>
+      <w:pPr>
+        <w:spacing w:after="0" w:before="120"/>
+      </w:pPr>
+    </w:p>
+    <w:p>
+      <w:pPr>
+        <w:pStyle w:val="Heading2"/>
+        <w:spacing w:after="60" w:before="200"/>
+      </w:pPr>
+      <w:r>
+        <w:rPr>
           <w:rFonts w:ascii="Arial" w:cs="Arial" w:eastAsia="Arial" w:hAnsi="Arial"/>
           <w:b/>
           <w:bCs/>
-          <w:sz w:val="24"/>
-          <w:szCs w:val="24"/>
-        </w:rPr>
-        <w:t xml:space="preserve">Daily 24hr shift DMs</w:t>
-      </w:r>
-      <w:r>
-        <w:rPr>
-          <w:rFonts w:ascii="Arial" w:cs="Arial" w:eastAsia="Arial" w:hAnsi="Arial"/>
-          <w:sz w:val="24"/>
-          <w:szCs w:val="24"/>
-        </w:rPr>
-        <w:t xml:space="preserve"> — morning DMs for shifts that day.</w:t>
+          <w:color w:val="333333"/>
+          <w:sz w:val="24"/>
+          <w:szCs w:val="24"/>
+        </w:rPr>
+        <w:t xml:space="preserve">Confirming Coverage</w:t>
+      </w:r>
+    </w:p>
+    <w:p>
+      <w:pPr>
+        <w:spacing w:after="80" w:before="80"/>
+      </w:pPr>
+      <w:r>
+        <w:rPr>
+          <w:rFonts w:ascii="Arial" w:cs="Arial" w:eastAsia="Arial" w:hAnsi="Arial"/>
+          <w:sz w:val="24"/>
+          <w:szCs w:val="24"/>
+        </w:rPr>
+        <w:t xml:space="preserve">When someone reacts ✅ and enough people are available, the bot DMs the coverage manager. To confirm:</w:t>
+      </w:r>
+    </w:p>
+    <w:p>
+      <w:pPr>
+        <w:spacing w:after="0" w:before="80"/>
+      </w:pPr>
+    </w:p>
+    <w:p>
+      <w:pPr>
+        <w:spacing w:after="80" w:before="80"/>
+      </w:pPr>
+      <w:r>
+        <w:rPr>
+          <w:rFonts w:ascii="Arial" w:cs="Arial" w:eastAsia="Arial" w:hAnsi="Arial"/>
+          <w:b/>
+          <w:bCs/>
+          <w:sz w:val="24"/>
+          <w:szCs w:val="24"/>
+        </w:rPr>
+        <w:t xml:space="preserve">From the coverage channel: </w:t>
+      </w:r>
+      <w:r>
+        <w:rPr>
+          <w:rFonts w:ascii="Arial" w:cs="Arial" w:eastAsia="Arial" w:hAnsi="Arial"/>
+          <w:sz w:val="24"/>
+          <w:szCs w:val="24"/>
+        </w:rPr>
+        <w:t xml:space="preserve">click the </w:t>
+      </w:r>
+      <w:r>
+        <w:rPr>
+          <w:rFonts w:ascii="Arial" w:cs="Arial" w:eastAsia="Arial" w:hAnsi="Arial"/>
+          <w:b/>
+          <w:bCs/>
+          <w:sz w:val="24"/>
+          <w:szCs w:val="24"/>
+        </w:rPr>
+        <w:t xml:space="preserve">Confirm Coverage</w:t>
+      </w:r>
+      <w:r>
+        <w:rPr>
+          <w:rFonts w:ascii="Arial" w:cs="Arial" w:eastAsia="Arial" w:hAnsi="Arial"/>
+          <w:sz w:val="24"/>
+          <w:szCs w:val="24"/>
+        </w:rPr>
+        <w:t xml:space="preserve"> button on the shift post. A dropdown lists everyone who reacted ✅. Select the person taking the shift and submit.</w:t>
+      </w:r>
+    </w:p>
+    <w:p>
+      <w:pPr>
+        <w:spacing w:after="80" w:before="80"/>
+      </w:pPr>
+      <w:r>
+        <w:rPr>
+          <w:rFonts w:ascii="Arial" w:cs="Arial" w:eastAsia="Arial" w:hAnsi="Arial"/>
+          <w:b/>
+          <w:bCs/>
+          <w:sz w:val="24"/>
+          <w:szCs w:val="24"/>
+        </w:rPr>
+        <w:t xml:space="preserve">From /open-coverage: </w:t>
+      </w:r>
+      <w:r>
+        <w:rPr>
+          <w:rFonts w:ascii="Arial" w:cs="Arial" w:eastAsia="Arial" w:hAnsi="Arial"/>
+          <w:sz w:val="24"/>
+          <w:szCs w:val="24"/>
+        </w:rPr>
+        <w:t xml:space="preserve">same flow — the Confirm button on each item opens the same dropdown.</w:t>
+      </w:r>
+    </w:p>
+    <w:p>
+      <w:pPr>
+        <w:spacing w:after="80" w:before="80"/>
+      </w:pPr>
+      <w:r>
+        <w:rPr>
+          <w:rFonts w:ascii="Arial" w:cs="Arial" w:eastAsia="Arial" w:hAnsi="Arial"/>
+          <w:sz w:val="24"/>
+          <w:szCs w:val="24"/>
+        </w:rPr>
+        <w:t xml:space="preserve">For multi-role shows (MFB, The Endings), a dropdown appears for each role. Select one person per role, then click Confirm.</w:t>
+      </w:r>
+    </w:p>
+    <w:p>
+      <w:pPr>
+        <w:spacing w:after="0" w:before="120"/>
+      </w:pPr>
+    </w:p>
+    <w:p>
+      <w:pPr>
+        <w:pStyle w:val="Heading2"/>
+        <w:spacing w:after="60" w:before="200"/>
+      </w:pPr>
+      <w:r>
+        <w:rPr>
+          <w:rFonts w:ascii="Arial" w:cs="Arial" w:eastAsia="Arial" w:hAnsi="Arial"/>
+          <w:b/>
+          <w:bCs/>
+          <w:color w:val="333333"/>
+          <w:sz w:val="24"/>
+          <w:szCs w:val="24"/>
+        </w:rPr>
+        <w:t xml:space="preserve">Channel Configuration</w:t>
+      </w:r>
+    </w:p>
+    <w:p>
+      <w:pPr>
+        <w:pStyle w:val="ListParagraph"/>
+        <w:numPr>
+          <w:ilvl w:val="0"/>
+          <w:numId w:val="2"/>
+        </w:numPr>
+        <w:spacing w:after="60" w:before="60"/>
+      </w:pPr>
+      <w:r>
+        <w:rPr>
+          <w:rFonts w:ascii="Courier New" w:cs="Courier New" w:eastAsia="Courier New" w:hAnsi="Courier New"/>
+          <w:color w:val="333333"/>
+          <w:sz w:val="22"/>
+          <w:szCs w:val="22"/>
+        </w:rPr>
+        <w:t xml:space="preserve">/set-coverage-channel</w:t>
+      </w:r>
+      <w:r>
+        <w:rPr>
+          <w:rFonts w:ascii="Arial" w:cs="Arial" w:eastAsia="Arial" w:hAnsi="Arial"/>
+          <w:sz w:val="24"/>
+          <w:szCs w:val="24"/>
+        </w:rPr>
+        <w:t xml:space="preserve"> — configure where coverage requests post. See First-Time Setup.</w:t>
+      </w:r>
+    </w:p>
+    <w:p>
+      <w:pPr>
+        <w:pStyle w:val="ListParagraph"/>
+        <w:numPr>
+          <w:ilvl w:val="0"/>
+          <w:numId w:val="2"/>
+        </w:numPr>
+        <w:spacing w:after="60" w:before="60"/>
+      </w:pPr>
+      <w:r>
+        <w:rPr>
+          <w:rFonts w:ascii="Courier New" w:cs="Courier New" w:eastAsia="Courier New" w:hAnsi="Courier New"/>
+          <w:color w:val="333333"/>
+          <w:sz w:val="22"/>
+          <w:szCs w:val="22"/>
+        </w:rPr>
+        <w:t xml:space="preserve">/list-coverage-channels</w:t>
+      </w:r>
+      <w:r>
+        <w:rPr>
+          <w:rFonts w:ascii="Arial" w:cs="Arial" w:eastAsia="Arial" w:hAnsi="Arial"/>
+          <w:sz w:val="24"/>
+          <w:szCs w:val="24"/>
+        </w:rPr>
+        <w:t xml:space="preserve"> — shows current channel assignments for all shows.</w:t>
+      </w:r>
+    </w:p>
+    <w:p>
+      <w:pPr>
+        <w:pStyle w:val="ListParagraph"/>
+        <w:numPr>
+          <w:ilvl w:val="0"/>
+          <w:numId w:val="2"/>
+        </w:numPr>
+        <w:spacing w:after="60" w:before="60"/>
+      </w:pPr>
+      <w:r>
+        <w:rPr>
+          <w:rFonts w:ascii="Courier New" w:cs="Courier New" w:eastAsia="Courier New" w:hAnsi="Courier New"/>
+          <w:color w:val="333333"/>
+          <w:sz w:val="22"/>
+          <w:szCs w:val="22"/>
+        </w:rPr>
+        <w:t xml:space="preserve">/set-coverage-manager</w:t>
+      </w:r>
+      <w:r>
+        <w:rPr>
+          <w:rFonts w:ascii="Arial" w:cs="Arial" w:eastAsia="Arial" w:hAnsi="Arial"/>
+          <w:sz w:val="24"/>
+          <w:szCs w:val="24"/>
+        </w:rPr>
+        <w:t xml:space="preserve"> — set who receives fillable-shift DMs and the nightly EOD coverage summary.</w:t>
       </w:r>
     </w:p>
     <w:p>
@@ -1955,7 +2113,566 @@
           <w:sz w:val="30"/>
           <w:szCs w:val="30"/>
         </w:rPr>
-        <w:t xml:space="preserve">8. Command Reference</w:t>
+        <w:t xml:space="preserve">6. Check-in Monitoring</w:t>
+      </w:r>
+    </w:p>
+    <w:p>
+      <w:pPr>
+        <w:spacing w:after="80" w:before="80"/>
+      </w:pPr>
+      <w:r>
+        <w:rPr>
+          <w:rFonts w:ascii="Arial" w:cs="Arial" w:eastAsia="Arial" w:hAnsi="Arial"/>
+          <w:sz w:val="24"/>
+          <w:szCs w:val="24"/>
+        </w:rPr>
+        <w:t xml:space="preserve">The bot seeds check-in records from Bookeo each morning and fires alerts at call time for cast members who haven’t checked in.</w:t>
+      </w:r>
+    </w:p>
+    <w:p>
+      <w:pPr>
+        <w:spacing w:after="0" w:before="80"/>
+      </w:pPr>
+    </w:p>
+    <w:p>
+      <w:pPr>
+        <w:pStyle w:val="ListParagraph"/>
+        <w:numPr>
+          <w:ilvl w:val="0"/>
+          <w:numId w:val="2"/>
+        </w:numPr>
+        <w:spacing w:after="60" w:before="60"/>
+      </w:pPr>
+      <w:r>
+        <w:rPr>
+          <w:rFonts w:ascii="Courier New" w:cs="Courier New" w:eastAsia="Courier New" w:hAnsi="Courier New"/>
+          <w:color w:val="333333"/>
+          <w:sz w:val="22"/>
+          <w:szCs w:val="22"/>
+        </w:rPr>
+        <w:t xml:space="preserve">/checkin-status</w:t>
+      </w:r>
+      <w:r>
+        <w:rPr>
+          <w:rFonts w:ascii="Arial" w:cs="Arial" w:eastAsia="Arial" w:hAnsi="Arial"/>
+          <w:sz w:val="24"/>
+          <w:szCs w:val="24"/>
+        </w:rPr>
+        <w:t xml:space="preserve"> — shows check-in records for the last 3 days. States: checked in, alert fired, missed (bug), or pending.</w:t>
+      </w:r>
+    </w:p>
+    <w:p>
+      <w:pPr>
+        <w:pStyle w:val="ListParagraph"/>
+        <w:numPr>
+          <w:ilvl w:val="0"/>
+          <w:numId w:val="2"/>
+        </w:numPr>
+        <w:spacing w:after="60" w:before="60"/>
+      </w:pPr>
+      <w:r>
+        <w:rPr>
+          <w:rFonts w:ascii="Courier New" w:cs="Courier New" w:eastAsia="Courier New" w:hAnsi="Courier New"/>
+          <w:color w:val="333333"/>
+          <w:sz w:val="22"/>
+          <w:szCs w:val="22"/>
+        </w:rPr>
+        <w:t xml:space="preserve">/force-checkin user:@User</w:t>
+      </w:r>
+      <w:r>
+        <w:rPr>
+          <w:rFonts w:ascii="Arial" w:cs="Arial" w:eastAsia="Arial" w:hAnsi="Arial"/>
+          <w:sz w:val="24"/>
+          <w:szCs w:val="24"/>
+        </w:rPr>
+        <w:t xml:space="preserve"> — manually marks a cast member as checked in. Add </w:t>
+      </w:r>
+      <w:r>
+        <w:rPr>
+          <w:rFonts w:ascii="Courier New" w:cs="Courier New" w:eastAsia="Courier New" w:hAnsi="Courier New"/>
+          <w:color w:val="333333"/>
+          <w:sz w:val="22"/>
+          <w:szCs w:val="22"/>
+        </w:rPr>
+        <w:t xml:space="preserve">show:X</w:t>
+      </w:r>
+      <w:r>
+        <w:rPr>
+          <w:rFonts w:ascii="Arial" w:cs="Arial" w:eastAsia="Arial" w:hAnsi="Arial"/>
+          <w:sz w:val="24"/>
+          <w:szCs w:val="24"/>
+        </w:rPr>
+        <w:t xml:space="preserve"> if they have multiple shifts today.</w:t>
+      </w:r>
+    </w:p>
+    <w:p>
+      <w:pPr>
+        <w:spacing w:after="0" w:before="80"/>
+      </w:pPr>
+    </w:p>
+    <w:p>
+      <w:pPr>
+        <w:spacing w:after="80" w:before="80"/>
+      </w:pPr>
+      <w:r>
+        <w:rPr>
+          <w:rFonts w:ascii="Arial" w:cs="Arial" w:eastAsia="Arial" w:hAnsi="Arial"/>
+          <w:b/>
+          <w:bCs/>
+          <w:sz w:val="24"/>
+          <w:szCs w:val="24"/>
+        </w:rPr>
+        <w:t xml:space="preserve">Managing alert contacts: </w:t>
+      </w:r>
+      <w:r>
+        <w:rPr>
+          <w:rFonts w:ascii="Courier New" w:cs="Courier New" w:eastAsia="Courier New" w:hAnsi="Courier New"/>
+          <w:color w:val="333333"/>
+          <w:sz w:val="22"/>
+          <w:szCs w:val="22"/>
+        </w:rPr>
+        <w:t xml:space="preserve">/add-checkin-contact</w:t>
+      </w:r>
+      <w:r>
+        <w:rPr>
+          <w:rFonts w:ascii="Arial" w:cs="Arial" w:eastAsia="Arial" w:hAnsi="Arial"/>
+          <w:sz w:val="24"/>
+          <w:szCs w:val="24"/>
+        </w:rPr>
+        <w:t xml:space="preserve">, </w:t>
+      </w:r>
+      <w:r>
+        <w:rPr>
+          <w:rFonts w:ascii="Courier New" w:cs="Courier New" w:eastAsia="Courier New" w:hAnsi="Courier New"/>
+          <w:color w:val="333333"/>
+          <w:sz w:val="22"/>
+          <w:szCs w:val="22"/>
+        </w:rPr>
+        <w:t xml:space="preserve">/remove-checkin-contact</w:t>
+      </w:r>
+      <w:r>
+        <w:rPr>
+          <w:rFonts w:ascii="Arial" w:cs="Arial" w:eastAsia="Arial" w:hAnsi="Arial"/>
+          <w:sz w:val="24"/>
+          <w:szCs w:val="24"/>
+        </w:rPr>
+        <w:t xml:space="preserve">, </w:t>
+      </w:r>
+      <w:r>
+        <w:rPr>
+          <w:rFonts w:ascii="Courier New" w:cs="Courier New" w:eastAsia="Courier New" w:hAnsi="Courier New"/>
+          <w:color w:val="333333"/>
+          <w:sz w:val="22"/>
+          <w:szCs w:val="22"/>
+        </w:rPr>
+        <w:t xml:space="preserve">/list-checkin-contacts</w:t>
+      </w:r>
+      <w:r>
+        <w:rPr>
+          <w:rFonts w:ascii="Arial" w:cs="Arial" w:eastAsia="Arial" w:hAnsi="Arial"/>
+          <w:sz w:val="24"/>
+          <w:szCs w:val="24"/>
+        </w:rPr>
+        <w:t xml:space="preserve">.</w:t>
+      </w:r>
+    </w:p>
+    <w:p>
+      <w:pPr>
+        <w:pBdr>
+          <w:bottom w:val="single" w:color="CCCCCC" w:sz="4" w:space="1"/>
+        </w:pBdr>
+        <w:spacing w:after="160" w:before="160"/>
+      </w:pPr>
+    </w:p>
+    <w:p>
+      <w:pPr>
+        <w:pStyle w:val="Heading1"/>
+        <w:spacing w:after="100" w:before="320"/>
+      </w:pPr>
+      <w:r>
+        <w:rPr>
+          <w:rFonts w:ascii="Arial" w:cs="Arial" w:eastAsia="Arial" w:hAnsi="Arial"/>
+          <w:b/>
+          <w:bCs/>
+          <w:color w:val="2E5FA3"/>
+          <w:sz w:val="30"/>
+          <w:szCs w:val="30"/>
+        </w:rPr>
+        <w:t xml:space="preserve">7. Bot Settings</w:t>
+      </w:r>
+    </w:p>
+    <w:p>
+      <w:pPr>
+        <w:spacing w:after="80" w:before="80"/>
+      </w:pPr>
+      <w:r>
+        <w:rPr>
+          <w:rFonts w:ascii="Courier New" w:cs="Courier New" w:eastAsia="Courier New" w:hAnsi="Courier New"/>
+          <w:color w:val="333333"/>
+          <w:sz w:val="22"/>
+          <w:szCs w:val="22"/>
+        </w:rPr>
+        <w:t xml:space="preserve">/bot-config setting:X value:On|Off</w:t>
+      </w:r>
+      <w:r>
+        <w:rPr>
+          <w:rFonts w:ascii="Arial" w:cs="Arial" w:eastAsia="Arial" w:hAnsi="Arial"/>
+          <w:sz w:val="24"/>
+          <w:szCs w:val="24"/>
+        </w:rPr>
+        <w:t xml:space="preserve"> — toggle automated shift DMs.</w:t>
+      </w:r>
+    </w:p>
+    <w:p>
+      <w:pPr>
+        <w:pStyle w:val="ListParagraph"/>
+        <w:numPr>
+          <w:ilvl w:val="0"/>
+          <w:numId w:val="2"/>
+        </w:numPr>
+        <w:spacing w:after="60" w:before="60"/>
+      </w:pPr>
+      <w:r>
+        <w:rPr>
+          <w:rFonts w:ascii="Arial" w:cs="Arial" w:eastAsia="Arial" w:hAnsi="Arial"/>
+          <w:b/>
+          <w:bCs/>
+          <w:sz w:val="24"/>
+          <w:szCs w:val="24"/>
+        </w:rPr>
+        <w:t xml:space="preserve">Weekly shift DMs</w:t>
+      </w:r>
+      <w:r>
+        <w:rPr>
+          <w:rFonts w:ascii="Arial" w:cs="Arial" w:eastAsia="Arial" w:hAnsi="Arial"/>
+          <w:sz w:val="24"/>
+          <w:szCs w:val="24"/>
+        </w:rPr>
+        <w:t xml:space="preserve"> — Sunday DMs covering the next 7 days.</w:t>
+      </w:r>
+    </w:p>
+    <w:p>
+      <w:pPr>
+        <w:pStyle w:val="ListParagraph"/>
+        <w:numPr>
+          <w:ilvl w:val="0"/>
+          <w:numId w:val="2"/>
+        </w:numPr>
+        <w:spacing w:after="60" w:before="60"/>
+      </w:pPr>
+      <w:r>
+        <w:rPr>
+          <w:rFonts w:ascii="Arial" w:cs="Arial" w:eastAsia="Arial" w:hAnsi="Arial"/>
+          <w:b/>
+          <w:bCs/>
+          <w:sz w:val="24"/>
+          <w:szCs w:val="24"/>
+        </w:rPr>
+        <w:t xml:space="preserve">Daily 24hr shift DMs</w:t>
+      </w:r>
+      <w:r>
+        <w:rPr>
+          <w:rFonts w:ascii="Arial" w:cs="Arial" w:eastAsia="Arial" w:hAnsi="Arial"/>
+          <w:sz w:val="24"/>
+          <w:szCs w:val="24"/>
+        </w:rPr>
+        <w:t xml:space="preserve"> — morning DMs for shifts that day.</w:t>
+      </w:r>
+    </w:p>
+    <w:p>
+      <w:pPr>
+        <w:pBdr>
+          <w:bottom w:val="single" w:color="CCCCCC" w:sz="4" w:space="1"/>
+        </w:pBdr>
+        <w:spacing w:after="160" w:before="160"/>
+      </w:pPr>
+    </w:p>
+    <w:p>
+      <w:pPr>
+        <w:pStyle w:val="Heading1"/>
+        <w:spacing w:after="100" w:before="320"/>
+      </w:pPr>
+      <w:r>
+        <w:rPr>
+          <w:rFonts w:ascii="Arial" w:cs="Arial" w:eastAsia="Arial" w:hAnsi="Arial"/>
+          <w:b/>
+          <w:bCs/>
+          <w:color w:val="2E5FA3"/>
+          <w:sz w:val="30"/>
+          <w:szCs w:val="30"/>
+        </w:rPr>
+        <w:t xml:space="preserve">8. Cleanup</w:t>
+      </w:r>
+    </w:p>
+    <w:p>
+      <w:pPr>
+        <w:spacing w:after="80" w:before="80"/>
+      </w:pPr>
+      <w:r>
+        <w:rPr>
+          <w:rFonts w:ascii="Courier New" w:cs="Courier New" w:eastAsia="Courier New" w:hAnsi="Courier New"/>
+          <w:color w:val="333333"/>
+          <w:sz w:val="22"/>
+          <w:szCs w:val="22"/>
+        </w:rPr>
+        <w:t xml:space="preserve">/purge type:X id:N</w:t>
+      </w:r>
+      <w:r>
+        <w:rPr>
+          <w:rFonts w:ascii="Arial" w:cs="Arial" w:eastAsia="Arial" w:hAnsi="Arial"/>
+          <w:sz w:val="24"/>
+          <w:szCs w:val="24"/>
+        </w:rPr>
+        <w:t xml:space="preserve"> — hard-deletes a record and its Discord post(s). Use when something went wrong and you need a clean slate. </w:t>
+      </w:r>
+      <w:r>
+        <w:rPr>
+          <w:rFonts w:ascii="Arial" w:cs="Arial" w:eastAsia="Arial" w:hAnsi="Arial"/>
+          <w:b/>
+          <w:bCs/>
+          <w:sz w:val="24"/>
+          <w:szCs w:val="24"/>
+        </w:rPr>
+        <w:t xml:space="preserve">This is permanent and cannot be undone.</w:t>
+      </w:r>
+    </w:p>
+    <w:p>
+      <w:pPr>
+        <w:spacing w:after="0" w:before="80"/>
+      </w:pPr>
+    </w:p>
+    <w:tbl>
+      <w:tblPr>
+        <w:tblW w:type="dxa" w:w="9360"/>
+        <w:tblBorders>
+          <w:top w:val="single" w:color="auto" w:sz="4"/>
+          <w:left w:val="single" w:color="auto" w:sz="4"/>
+          <w:bottom w:val="single" w:color="auto" w:sz="4"/>
+          <w:right w:val="single" w:color="auto" w:sz="4"/>
+          <w:insideH w:val="single" w:color="auto" w:sz="4"/>
+          <w:insideV w:val="single" w:color="auto" w:sz="4"/>
+        </w:tblBorders>
+      </w:tblPr>
+      <w:tblGrid>
+        <w:gridCol w:w="2800"/>
+        <w:gridCol w:w="6560"/>
+      </w:tblGrid>
+      <w:tr>
+        <w:tc>
+          <w:tcPr>
+            <w:tcW w:type="dxa" w:w="2800"/>
+            <w:tcBorders>
+              <w:top w:val="single" w:color="CCCCCC" w:sz="1"/>
+              <w:left w:val="single" w:color="CCCCCC" w:sz="1"/>
+              <w:bottom w:val="single" w:color="CCCCCC" w:sz="1"/>
+              <w:right w:val="single" w:color="CCCCCC" w:sz="1"/>
+            </w:tcBorders>
+            <w:shd w:fill="D6E4F7" w:val="clear"/>
+            <w:tcMar>
+              <w:top w:type="dxa" w:w="80"/>
+              <w:left w:type="dxa" w:w="120"/>
+              <w:bottom w:type="dxa" w:w="80"/>
+              <w:right w:type="dxa" w:w="120"/>
+            </w:tcMar>
+          </w:tcPr>
+          <w:p>
+            <w:r>
+              <w:rPr>
+                <w:rFonts w:ascii="Arial" w:cs="Arial" w:eastAsia="Arial" w:hAnsi="Arial"/>
+                <w:b/>
+                <w:bCs/>
+                <w:sz w:val="22"/>
+                <w:szCs w:val="22"/>
+              </w:rPr>
+              <w:t xml:space="preserve">Type</w:t>
+            </w:r>
+          </w:p>
+        </w:tc>
+        <w:tc>
+          <w:tcPr>
+            <w:tcW w:type="dxa" w:w="6560"/>
+            <w:tcBorders>
+              <w:top w:val="single" w:color="CCCCCC" w:sz="1"/>
+              <w:left w:val="single" w:color="CCCCCC" w:sz="1"/>
+              <w:bottom w:val="single" w:color="CCCCCC" w:sz="1"/>
+              <w:right w:val="single" w:color="CCCCCC" w:sz="1"/>
+            </w:tcBorders>
+            <w:shd w:fill="D6E4F7" w:val="clear"/>
+            <w:tcMar>
+              <w:top w:type="dxa" w:w="80"/>
+              <w:left w:type="dxa" w:w="120"/>
+              <w:bottom w:type="dxa" w:w="80"/>
+              <w:right w:type="dxa" w:w="120"/>
+            </w:tcMar>
+          </w:tcPr>
+          <w:p>
+            <w:r>
+              <w:rPr>
+                <w:rFonts w:ascii="Arial" w:cs="Arial" w:eastAsia="Arial" w:hAnsi="Arial"/>
+                <w:b/>
+                <w:bCs/>
+                <w:sz w:val="22"/>
+                <w:szCs w:val="22"/>
+              </w:rPr>
+              <w:t xml:space="preserve">What it deletes</w:t>
+            </w:r>
+          </w:p>
+        </w:tc>
+      </w:tr>
+      <w:tr>
+        <w:tc>
+          <w:tcPr>
+            <w:tcW w:type="dxa" w:w="2800"/>
+            <w:tcBorders>
+              <w:top w:val="single" w:color="CCCCCC" w:sz="1"/>
+              <w:left w:val="single" w:color="CCCCCC" w:sz="1"/>
+              <w:bottom w:val="single" w:color="CCCCCC" w:sz="1"/>
+              <w:right w:val="single" w:color="CCCCCC" w:sz="1"/>
+            </w:tcBorders>
+            <w:tcMar>
+              <w:top w:type="dxa" w:w="80"/>
+              <w:left w:type="dxa" w:w="120"/>
+              <w:bottom w:type="dxa" w:w="80"/>
+              <w:right w:type="dxa" w:w="120"/>
+            </w:tcMar>
+          </w:tcPr>
+          <w:p>
+            <w:r>
+              <w:rPr>
+                <w:rFonts w:ascii="Arial" w:cs="Arial" w:eastAsia="Arial" w:hAnsi="Arial"/>
+                <w:sz w:val="22"/>
+                <w:szCs w:val="22"/>
+              </w:rPr>
+              <w:t xml:space="preserve">Coverage Shift</w:t>
+            </w:r>
+          </w:p>
+        </w:tc>
+        <w:tc>
+          <w:tcPr>
+            <w:tcW w:type="dxa" w:w="6560"/>
+            <w:tcBorders>
+              <w:top w:val="single" w:color="CCCCCC" w:sz="1"/>
+              <w:left w:val="single" w:color="CCCCCC" w:sz="1"/>
+              <w:bottom w:val="single" w:color="CCCCCC" w:sz="1"/>
+              <w:right w:val="single" w:color="CCCCCC" w:sz="1"/>
+            </w:tcBorders>
+            <w:tcMar>
+              <w:top w:type="dxa" w:w="80"/>
+              <w:left w:type="dxa" w:w="120"/>
+              <w:bottom w:type="dxa" w:w="80"/>
+              <w:right w:type="dxa" w:w="120"/>
+            </w:tcMar>
+          </w:tcPr>
+          <w:p>
+            <w:r>
+              <w:rPr>
+                <w:rFonts w:ascii="Arial" w:cs="Arial" w:eastAsia="Arial" w:hAnsi="Arial"/>
+                <w:sz w:val="22"/>
+                <w:szCs w:val="22"/>
+              </w:rPr>
+              <w:t xml:space="preserve">The shift post and DB row. If it was the only shift in its request, also removes the header post and parent request.</w:t>
+            </w:r>
+          </w:p>
+        </w:tc>
+      </w:tr>
+      <w:tr>
+        <w:tc>
+          <w:tcPr>
+            <w:tcW w:type="dxa" w:w="2800"/>
+            <w:tcBorders>
+              <w:top w:val="single" w:color="CCCCCC" w:sz="1"/>
+              <w:left w:val="single" w:color="CCCCCC" w:sz="1"/>
+              <w:bottom w:val="single" w:color="CCCCCC" w:sz="1"/>
+              <w:right w:val="single" w:color="CCCCCC" w:sz="1"/>
+            </w:tcBorders>
+            <w:tcMar>
+              <w:top w:type="dxa" w:w="80"/>
+              <w:left w:type="dxa" w:w="120"/>
+              <w:bottom w:type="dxa" w:w="80"/>
+              <w:right w:type="dxa" w:w="120"/>
+            </w:tcMar>
+          </w:tcPr>
+          <w:p>
+            <w:r>
+              <w:rPr>
+                <w:rFonts w:ascii="Arial" w:cs="Arial" w:eastAsia="Arial" w:hAnsi="Arial"/>
+                <w:sz w:val="22"/>
+                <w:szCs w:val="22"/>
+              </w:rPr>
+              <w:t xml:space="preserve">Custom Game</w:t>
+            </w:r>
+          </w:p>
+        </w:tc>
+        <w:tc>
+          <w:tcPr>
+            <w:tcW w:type="dxa" w:w="6560"/>
+            <w:tcBorders>
+              <w:top w:val="single" w:color="CCCCCC" w:sz="1"/>
+              <w:left w:val="single" w:color="CCCCCC" w:sz="1"/>
+              <w:bottom w:val="single" w:color="CCCCCC" w:sz="1"/>
+              <w:right w:val="single" w:color="CCCCCC" w:sz="1"/>
+            </w:tcBorders>
+            <w:tcMar>
+              <w:top w:type="dxa" w:w="80"/>
+              <w:left w:type="dxa" w:w="120"/>
+              <w:bottom w:type="dxa" w:w="80"/>
+              <w:right w:type="dxa" w:w="120"/>
+            </w:tcMar>
+          </w:tcPr>
+          <w:p>
+            <w:r>
+              <w:rPr>
+                <w:rFonts w:ascii="Arial" w:cs="Arial" w:eastAsia="Arial" w:hAnsi="Arial"/>
+                <w:sz w:val="22"/>
+                <w:szCs w:val="22"/>
+              </w:rPr>
+              <w:t xml:space="preserve">The game post and DB row.</w:t>
+            </w:r>
+          </w:p>
+        </w:tc>
+      </w:tr>
+    </w:tbl>
+    <w:p>
+      <w:pPr>
+        <w:spacing w:after="0" w:before="80"/>
+      </w:pPr>
+    </w:p>
+    <w:p>
+      <w:pPr>
+        <w:spacing w:after="80" w:before="80"/>
+      </w:pPr>
+      <w:r>
+        <w:rPr>
+          <w:rFonts w:ascii="Arial" w:cs="Arial" w:eastAsia="Arial" w:hAnsi="Arial"/>
+          <w:sz w:val="24"/>
+          <w:szCs w:val="24"/>
+        </w:rPr>
+        <w:t xml:space="preserve">If the Discord post was already manually deleted, the purge still cleans up the DB record.</w:t>
+      </w:r>
+    </w:p>
+    <w:p>
+      <w:pPr>
+        <w:pBdr>
+          <w:bottom w:val="single" w:color="CCCCCC" w:sz="4" w:space="1"/>
+        </w:pBdr>
+        <w:spacing w:after="160" w:before="160"/>
+      </w:pPr>
+    </w:p>
+    <w:p>
+      <w:pPr>
+        <w:pStyle w:val="Heading1"/>
+        <w:spacing w:after="100" w:before="320"/>
+      </w:pPr>
+      <w:r>
+        <w:rPr>
+          <w:rFonts w:ascii="Arial" w:cs="Arial" w:eastAsia="Arial" w:hAnsi="Arial"/>
+          <w:b/>
+          <w:bCs/>
+          <w:color w:val="2E5FA3"/>
+          <w:sz w:val="30"/>
+          <w:szCs w:val="30"/>
+        </w:rPr>
+        <w:t xml:space="preserve">9. Command Reference</w:t>
       </w:r>
     </w:p>
     <w:p>
@@ -2965,7 +3682,7 @@
                 <w:sz w:val="22"/>
                 <w:szCs w:val="22"/>
               </w:rPr>
-              <w:t xml:space="preserve">Delete a custom game post</w:t>
+              <w:t xml:space="preserve">Cancel a custom game and delete its post</w:t>
             </w:r>
           </w:p>
         </w:tc>
@@ -2995,7 +3712,7 @@
                 <w:sz w:val="21"/>
                 <w:szCs w:val="21"/>
               </w:rPr>
-              <w:t xml:space="preserve">/set-coverage-channel</w:t>
+              <w:t xml:space="preserve">/coverage-request</w:t>
             </w:r>
           </w:p>
         </w:tc>
@@ -3022,7 +3739,7 @@
                 <w:sz w:val="22"/>
                 <w:szCs w:val="22"/>
               </w:rPr>
-              <w:t xml:space="preserve">Set the coverage channel for a show/character</w:t>
+              <w:t xml:space="preserve">(Cast member) Submit a coverage request</w:t>
             </w:r>
           </w:p>
         </w:tc>
@@ -3052,6 +3769,177 @@
                 <w:sz w:val="21"/>
                 <w:szCs w:val="21"/>
               </w:rPr>
+              <w:t xml:space="preserve">/cancel-coverage-request</w:t>
+            </w:r>
+          </w:p>
+        </w:tc>
+        <w:tc>
+          <w:tcPr>
+            <w:tcW w:type="dxa" w:w="6160"/>
+            <w:tcBorders>
+              <w:top w:val="single" w:color="CCCCCC" w:sz="1"/>
+              <w:left w:val="single" w:color="CCCCCC" w:sz="1"/>
+              <w:bottom w:val="single" w:color="CCCCCC" w:sz="1"/>
+              <w:right w:val="single" w:color="CCCCCC" w:sz="1"/>
+            </w:tcBorders>
+            <w:tcMar>
+              <w:top w:type="dxa" w:w="60"/>
+              <w:left w:type="dxa" w:w="120"/>
+              <w:bottom w:type="dxa" w:w="60"/>
+              <w:right w:type="dxa" w:w="120"/>
+            </w:tcMar>
+          </w:tcPr>
+          <w:p>
+            <w:r>
+              <w:rPr>
+                <w:rFonts w:ascii="Arial" w:cs="Arial" w:eastAsia="Arial" w:hAnsi="Arial"/>
+                <w:sz w:val="22"/>
+                <w:szCs w:val="22"/>
+              </w:rPr>
+              <w:t xml:space="preserve">Cancel a single coverage shift by Shift ID</w:t>
+            </w:r>
+          </w:p>
+        </w:tc>
+      </w:tr>
+      <w:tr>
+        <w:tc>
+          <w:tcPr>
+            <w:tcW w:type="dxa" w:w="3200"/>
+            <w:tcBorders>
+              <w:top w:val="single" w:color="CCCCCC" w:sz="1"/>
+              <w:left w:val="single" w:color="CCCCCC" w:sz="1"/>
+              <w:bottom w:val="single" w:color="CCCCCC" w:sz="1"/>
+              <w:right w:val="single" w:color="CCCCCC" w:sz="1"/>
+            </w:tcBorders>
+            <w:tcMar>
+              <w:top w:type="dxa" w:w="60"/>
+              <w:left w:type="dxa" w:w="120"/>
+              <w:bottom w:type="dxa" w:w="60"/>
+              <w:right w:type="dxa" w:w="120"/>
+            </w:tcMar>
+          </w:tcPr>
+          <w:p>
+            <w:r>
+              <w:rPr>
+                <w:rFonts w:ascii="Courier New" w:cs="Courier New" w:eastAsia="Courier New" w:hAnsi="Courier New"/>
+                <w:color w:val="333333"/>
+                <w:sz w:val="21"/>
+                <w:szCs w:val="21"/>
+              </w:rPr>
+              <w:t xml:space="preserve">/open-coverage</w:t>
+            </w:r>
+          </w:p>
+        </w:tc>
+        <w:tc>
+          <w:tcPr>
+            <w:tcW w:type="dxa" w:w="6160"/>
+            <w:tcBorders>
+              <w:top w:val="single" w:color="CCCCCC" w:sz="1"/>
+              <w:left w:val="single" w:color="CCCCCC" w:sz="1"/>
+              <w:bottom w:val="single" w:color="CCCCCC" w:sz="1"/>
+              <w:right w:val="single" w:color="CCCCCC" w:sz="1"/>
+            </w:tcBorders>
+            <w:tcMar>
+              <w:top w:type="dxa" w:w="60"/>
+              <w:left w:type="dxa" w:w="120"/>
+              <w:bottom w:type="dxa" w:w="60"/>
+              <w:right w:type="dxa" w:w="120"/>
+            </w:tcMar>
+          </w:tcPr>
+          <w:p>
+            <w:r>
+              <w:rPr>
+                <w:rFonts w:ascii="Arial" w:cs="Arial" w:eastAsia="Arial" w:hAnsi="Arial"/>
+                <w:sz w:val="22"/>
+                <w:szCs w:val="22"/>
+              </w:rPr>
+              <w:t xml:space="preserve">View and manage all open requests and games</w:t>
+            </w:r>
+          </w:p>
+        </w:tc>
+      </w:tr>
+      <w:tr>
+        <w:tc>
+          <w:tcPr>
+            <w:tcW w:type="dxa" w:w="3200"/>
+            <w:tcBorders>
+              <w:top w:val="single" w:color="CCCCCC" w:sz="1"/>
+              <w:left w:val="single" w:color="CCCCCC" w:sz="1"/>
+              <w:bottom w:val="single" w:color="CCCCCC" w:sz="1"/>
+              <w:right w:val="single" w:color="CCCCCC" w:sz="1"/>
+            </w:tcBorders>
+            <w:tcMar>
+              <w:top w:type="dxa" w:w="60"/>
+              <w:left w:type="dxa" w:w="120"/>
+              <w:bottom w:type="dxa" w:w="60"/>
+              <w:right w:type="dxa" w:w="120"/>
+            </w:tcMar>
+          </w:tcPr>
+          <w:p>
+            <w:r>
+              <w:rPr>
+                <w:rFonts w:ascii="Courier New" w:cs="Courier New" w:eastAsia="Courier New" w:hAnsi="Courier New"/>
+                <w:color w:val="333333"/>
+                <w:sz w:val="21"/>
+                <w:szCs w:val="21"/>
+              </w:rPr>
+              <w:t xml:space="preserve">/set-coverage-channel</w:t>
+            </w:r>
+          </w:p>
+        </w:tc>
+        <w:tc>
+          <w:tcPr>
+            <w:tcW w:type="dxa" w:w="6160"/>
+            <w:tcBorders>
+              <w:top w:val="single" w:color="CCCCCC" w:sz="1"/>
+              <w:left w:val="single" w:color="CCCCCC" w:sz="1"/>
+              <w:bottom w:val="single" w:color="CCCCCC" w:sz="1"/>
+              <w:right w:val="single" w:color="CCCCCC" w:sz="1"/>
+            </w:tcBorders>
+            <w:tcMar>
+              <w:top w:type="dxa" w:w="60"/>
+              <w:left w:type="dxa" w:w="120"/>
+              <w:bottom w:type="dxa" w:w="60"/>
+              <w:right w:type="dxa" w:w="120"/>
+            </w:tcMar>
+          </w:tcPr>
+          <w:p>
+            <w:r>
+              <w:rPr>
+                <w:rFonts w:ascii="Arial" w:cs="Arial" w:eastAsia="Arial" w:hAnsi="Arial"/>
+                <w:sz w:val="22"/>
+                <w:szCs w:val="22"/>
+              </w:rPr>
+              <w:t xml:space="preserve">Set the coverage channel for a show/character</w:t>
+            </w:r>
+          </w:p>
+        </w:tc>
+      </w:tr>
+      <w:tr>
+        <w:tc>
+          <w:tcPr>
+            <w:tcW w:type="dxa" w:w="3200"/>
+            <w:tcBorders>
+              <w:top w:val="single" w:color="CCCCCC" w:sz="1"/>
+              <w:left w:val="single" w:color="CCCCCC" w:sz="1"/>
+              <w:bottom w:val="single" w:color="CCCCCC" w:sz="1"/>
+              <w:right w:val="single" w:color="CCCCCC" w:sz="1"/>
+            </w:tcBorders>
+            <w:tcMar>
+              <w:top w:type="dxa" w:w="60"/>
+              <w:left w:type="dxa" w:w="120"/>
+              <w:bottom w:type="dxa" w:w="60"/>
+              <w:right w:type="dxa" w:w="120"/>
+            </w:tcMar>
+          </w:tcPr>
+          <w:p>
+            <w:r>
+              <w:rPr>
+                <w:rFonts w:ascii="Courier New" w:cs="Courier New" w:eastAsia="Courier New" w:hAnsi="Courier New"/>
+                <w:color w:val="333333"/>
+                <w:sz w:val="21"/>
+                <w:szCs w:val="21"/>
+              </w:rPr>
               <w:t xml:space="preserve">/list-coverage-channels</w:t>
             </w:r>
           </w:p>
@@ -3080,6 +3968,63 @@
                 <w:szCs w:val="22"/>
               </w:rPr>
               <w:t xml:space="preserve">List all configured coverage channels</w:t>
+            </w:r>
+          </w:p>
+        </w:tc>
+      </w:tr>
+      <w:tr>
+        <w:tc>
+          <w:tcPr>
+            <w:tcW w:type="dxa" w:w="3200"/>
+            <w:tcBorders>
+              <w:top w:val="single" w:color="CCCCCC" w:sz="1"/>
+              <w:left w:val="single" w:color="CCCCCC" w:sz="1"/>
+              <w:bottom w:val="single" w:color="CCCCCC" w:sz="1"/>
+              <w:right w:val="single" w:color="CCCCCC" w:sz="1"/>
+            </w:tcBorders>
+            <w:tcMar>
+              <w:top w:type="dxa" w:w="60"/>
+              <w:left w:type="dxa" w:w="120"/>
+              <w:bottom w:type="dxa" w:w="60"/>
+              <w:right w:type="dxa" w:w="120"/>
+            </w:tcMar>
+          </w:tcPr>
+          <w:p>
+            <w:r>
+              <w:rPr>
+                <w:rFonts w:ascii="Courier New" w:cs="Courier New" w:eastAsia="Courier New" w:hAnsi="Courier New"/>
+                <w:color w:val="333333"/>
+                <w:sz w:val="21"/>
+                <w:szCs w:val="21"/>
+              </w:rPr>
+              <w:t xml:space="preserve">/set-coverage-manager</w:t>
+            </w:r>
+          </w:p>
+        </w:tc>
+        <w:tc>
+          <w:tcPr>
+            <w:tcW w:type="dxa" w:w="6160"/>
+            <w:tcBorders>
+              <w:top w:val="single" w:color="CCCCCC" w:sz="1"/>
+              <w:left w:val="single" w:color="CCCCCC" w:sz="1"/>
+              <w:bottom w:val="single" w:color="CCCCCC" w:sz="1"/>
+              <w:right w:val="single" w:color="CCCCCC" w:sz="1"/>
+            </w:tcBorders>
+            <w:tcMar>
+              <w:top w:type="dxa" w:w="60"/>
+              <w:left w:type="dxa" w:w="120"/>
+              <w:bottom w:type="dxa" w:w="60"/>
+              <w:right w:type="dxa" w:w="120"/>
+            </w:tcMar>
+          </w:tcPr>
+          <w:p>
+            <w:r>
+              <w:rPr>
+                <w:rFonts w:ascii="Arial" w:cs="Arial" w:eastAsia="Arial" w:hAnsi="Arial"/>
+                <w:sz w:val="22"/>
+                <w:szCs w:val="22"/>
+              </w:rPr>
+              <w:t xml:space="preserve">Set who receives fillable DMs and EOD summary</w:t>
             </w:r>
           </w:p>
         </w:tc>
@@ -3604,6 +4549,97 @@
                 <w:szCs w:val="22"/>
               </w:rPr>
               <w:t xml:space="preserve">Set the channel for bot error messages</w:t>
+            </w:r>
+          </w:p>
+        </w:tc>
+      </w:tr>
+      <w:tr>
+        <w:tc>
+          <w:tcPr>
+            <w:tcW w:type="dxa" w:w="9360"/>
+            <w:gridSpan w:val="2"/>
+            <w:tcBorders>
+              <w:top w:val="none" w:color="FFFFFF" w:sz="0"/>
+              <w:left w:val="none" w:color="FFFFFF" w:sz="0"/>
+              <w:bottom w:val="none" w:color="FFFFFF" w:sz="0"/>
+              <w:right w:val="none" w:color="FFFFFF" w:sz="0"/>
+            </w:tcBorders>
+            <w:shd w:fill="D6E4F7" w:val="clear"/>
+            <w:tcMar>
+              <w:top w:type="dxa" w:w="80"/>
+              <w:left w:type="dxa" w:w="120"/>
+              <w:bottom w:type="dxa" w:w="80"/>
+              <w:right w:type="dxa" w:w="120"/>
+            </w:tcMar>
+          </w:tcPr>
+          <w:p>
+            <w:r>
+              <w:rPr>
+                <w:rFonts w:ascii="Arial" w:cs="Arial" w:eastAsia="Arial" w:hAnsi="Arial"/>
+                <w:b/>
+                <w:bCs/>
+                <w:color w:val="2E5FA3"/>
+                <w:sz w:val="22"/>
+                <w:szCs w:val="22"/>
+              </w:rPr>
+              <w:t xml:space="preserve">Cleanup</w:t>
+            </w:r>
+          </w:p>
+        </w:tc>
+      </w:tr>
+      <w:tr>
+        <w:tc>
+          <w:tcPr>
+            <w:tcW w:type="dxa" w:w="3200"/>
+            <w:tcBorders>
+              <w:top w:val="single" w:color="CCCCCC" w:sz="1"/>
+              <w:left w:val="single" w:color="CCCCCC" w:sz="1"/>
+              <w:bottom w:val="single" w:color="CCCCCC" w:sz="1"/>
+              <w:right w:val="single" w:color="CCCCCC" w:sz="1"/>
+            </w:tcBorders>
+            <w:tcMar>
+              <w:top w:type="dxa" w:w="60"/>
+              <w:left w:type="dxa" w:w="120"/>
+              <w:bottom w:type="dxa" w:w="60"/>
+              <w:right w:type="dxa" w:w="120"/>
+            </w:tcMar>
+          </w:tcPr>
+          <w:p>
+            <w:r>
+              <w:rPr>
+                <w:rFonts w:ascii="Courier New" w:cs="Courier New" w:eastAsia="Courier New" w:hAnsi="Courier New"/>
+                <w:color w:val="333333"/>
+                <w:sz w:val="21"/>
+                <w:szCs w:val="21"/>
+              </w:rPr>
+              <w:t xml:space="preserve">/purge</w:t>
+            </w:r>
+          </w:p>
+        </w:tc>
+        <w:tc>
+          <w:tcPr>
+            <w:tcW w:type="dxa" w:w="6160"/>
+            <w:tcBorders>
+              <w:top w:val="single" w:color="CCCCCC" w:sz="1"/>
+              <w:left w:val="single" w:color="CCCCCC" w:sz="1"/>
+              <w:bottom w:val="single" w:color="CCCCCC" w:sz="1"/>
+              <w:right w:val="single" w:color="CCCCCC" w:sz="1"/>
+            </w:tcBorders>
+            <w:tcMar>
+              <w:top w:type="dxa" w:w="60"/>
+              <w:left w:type="dxa" w:w="120"/>
+              <w:bottom w:type="dxa" w:w="60"/>
+              <w:right w:type="dxa" w:w="120"/>
+            </w:tcMar>
+          </w:tcPr>
+          <w:p>
+            <w:r>
+              <w:rPr>
+                <w:rFonts w:ascii="Arial" w:cs="Arial" w:eastAsia="Arial" w:hAnsi="Arial"/>
+                <w:sz w:val="22"/>
+                <w:szCs w:val="22"/>
+              </w:rPr>
+              <w:t xml:space="preserve">Hard-delete a coverage shift or custom game record and its post</w:t>
             </w:r>
           </w:p>
         </w:tc>

</xml_diff>

<commit_message>
Document /coverage-stats across the guides
- COMMANDS.md: new /coverage-stats entry (owner-only 👑, options table,
  time-to-confirm caveat) + legend + quick-reference row.
- docs/admin-guide.md: "Coverage Stats (owner only)" section + admin
  command-table row; regenerated docs/admin-guide.docx from the updated
  scripts/build-admin-guide.js generator.
- STATUS.md: coverage-stats feature entry under "What's built and
  deployed"; refreshed last-updated date.

Co-Authored-By: Claude Opus 4.8 <noreply@anthropic.com>
Claude-Session: https://claude.ai/code/session_01QdKSJR8dvWLPQyYcYeXcoD
</commit_message>
<xml_diff>
--- a/docs/admin-guide.docx
+++ b/docs/admin-guide.docx
@@ -2059,6 +2059,254 @@
           <w:sz w:val="24"/>
           <w:szCs w:val="24"/>
         </w:rPr>
+        <w:t xml:space="preserve">Coverage Stats (owner only)</w:t>
+      </w:r>
+    </w:p>
+    <w:p>
+      <w:pPr>
+        <w:spacing w:after="80" w:before="80"/>
+      </w:pPr>
+      <w:r>
+        <w:rPr>
+          <w:rFonts w:ascii="Courier New" w:cs="Courier New" w:eastAsia="Courier New" w:hAnsi="Courier New"/>
+          <w:color w:val="333333"/>
+          <w:sz w:val="22"/>
+          <w:szCs w:val="22"/>
+        </w:rPr>
+        <w:t xml:space="preserve">/coverage-stats</w:t>
+      </w:r>
+      <w:r>
+        <w:rPr>
+          <w:rFonts w:ascii="Arial" w:cs="Arial" w:eastAsia="Arial" w:hAnsi="Arial"/>
+          <w:sz w:val="24"/>
+          <w:szCs w:val="24"/>
+        </w:rPr>
+        <w:t xml:space="preserve"> — a running log of who requests coverage and who covers for them. </w:t>
+      </w:r>
+      <w:r>
+        <w:rPr>
+          <w:rFonts w:ascii="Arial" w:cs="Arial" w:eastAsia="Arial" w:hAnsi="Arial"/>
+          <w:b/>
+          <w:bCs/>
+          <w:sz w:val="24"/>
+          <w:szCs w:val="24"/>
+        </w:rPr>
+        <w:t xml:space="preserve">Owner only</w:t>
+      </w:r>
+      <w:r>
+        <w:rPr>
+          <w:rFonts w:ascii="Arial" w:cs="Arial" w:eastAsia="Arial" w:hAnsi="Arial"/>
+          <w:sz w:val="24"/>
+          <w:szCs w:val="24"/>
+        </w:rPr>
+        <w:t xml:space="preserve"> (hidden from other admins); the report is private and covers your whole history.</w:t>
+      </w:r>
+    </w:p>
+    <w:p>
+      <w:pPr>
+        <w:spacing w:after="0" w:before="80"/>
+      </w:pPr>
+    </w:p>
+    <w:p>
+      <w:pPr>
+        <w:pStyle w:val="ListParagraph"/>
+        <w:numPr>
+          <w:ilvl w:val="0"/>
+          <w:numId w:val="2"/>
+        </w:numPr>
+        <w:spacing w:after="60" w:before="60"/>
+      </w:pPr>
+      <w:r>
+        <w:rPr>
+          <w:rFonts w:ascii="Arial" w:cs="Arial" w:eastAsia="Arial" w:hAnsi="Arial"/>
+          <w:b/>
+          <w:bCs/>
+          <w:sz w:val="24"/>
+          <w:szCs w:val="24"/>
+        </w:rPr>
+        <w:t xml:space="preserve">Leaderboard</w:t>
+      </w:r>
+      <w:r>
+        <w:rPr>
+          <w:rFonts w:ascii="Arial" w:cs="Arial" w:eastAsia="Arial" w:hAnsi="Arial"/>
+          <w:sz w:val="24"/>
+          <w:szCs w:val="24"/>
+        </w:rPr>
+        <w:t xml:space="preserve"> — per person: shifts + games covered, shifts requested (cancelled shown separately), and give/take ratio.</w:t>
+      </w:r>
+    </w:p>
+    <w:p>
+      <w:pPr>
+        <w:pStyle w:val="ListParagraph"/>
+        <w:numPr>
+          <w:ilvl w:val="0"/>
+          <w:numId w:val="2"/>
+        </w:numPr>
+        <w:spacing w:after="60" w:before="60"/>
+      </w:pPr>
+      <w:r>
+        <w:rPr>
+          <w:rFonts w:ascii="Arial" w:cs="Arial" w:eastAsia="Arial" w:hAnsi="Arial"/>
+          <w:b/>
+          <w:bCs/>
+          <w:sz w:val="24"/>
+          <w:szCs w:val="24"/>
+        </w:rPr>
+        <w:t xml:space="preserve">Fill rate</w:t>
+      </w:r>
+      <w:r>
+        <w:rPr>
+          <w:rFonts w:ascii="Arial" w:cs="Arial" w:eastAsia="Arial" w:hAnsi="Arial"/>
+          <w:sz w:val="24"/>
+          <w:szCs w:val="24"/>
+        </w:rPr>
+        <w:t xml:space="preserve"> — covered / cancelled / never-filled-and-passed, overall and per show.</w:t>
+      </w:r>
+    </w:p>
+    <w:p>
+      <w:pPr>
+        <w:pStyle w:val="ListParagraph"/>
+        <w:numPr>
+          <w:ilvl w:val="0"/>
+          <w:numId w:val="2"/>
+        </w:numPr>
+        <w:spacing w:after="60" w:before="60"/>
+      </w:pPr>
+      <w:r>
+        <w:rPr>
+          <w:rFonts w:ascii="Arial" w:cs="Arial" w:eastAsia="Arial" w:hAnsi="Arial"/>
+          <w:b/>
+          <w:bCs/>
+          <w:sz w:val="24"/>
+          <w:szCs w:val="24"/>
+        </w:rPr>
+        <w:t xml:space="preserve">Timing</w:t>
+      </w:r>
+      <w:r>
+        <w:rPr>
+          <w:rFonts w:ascii="Arial" w:cs="Arial" w:eastAsia="Arial" w:hAnsi="Arial"/>
+          <w:sz w:val="24"/>
+          <w:szCs w:val="24"/>
+        </w:rPr>
+        <w:t xml:space="preserve"> — median &amp; average time to coverage (measured to when a cover is confirmed) and lead time before showtime.</w:t>
+      </w:r>
+    </w:p>
+    <w:p>
+      <w:pPr>
+        <w:pStyle w:val="ListParagraph"/>
+        <w:numPr>
+          <w:ilvl w:val="0"/>
+          <w:numId w:val="2"/>
+        </w:numPr>
+        <w:spacing w:after="60" w:before="60"/>
+      </w:pPr>
+      <w:r>
+        <w:rPr>
+          <w:rFonts w:ascii="Arial" w:cs="Arial" w:eastAsia="Arial" w:hAnsi="Arial"/>
+          <w:b/>
+          <w:bCs/>
+          <w:sz w:val="24"/>
+          <w:szCs w:val="24"/>
+        </w:rPr>
+        <w:t xml:space="preserve">Most-needed</w:t>
+      </w:r>
+      <w:r>
+        <w:rPr>
+          <w:rFonts w:ascii="Arial" w:cs="Arial" w:eastAsia="Arial" w:hAnsi="Arial"/>
+          <w:sz w:val="24"/>
+          <w:szCs w:val="24"/>
+        </w:rPr>
+        <w:t xml:space="preserve"> — which shows, weekdays, and characters generate the most requests.</w:t>
+      </w:r>
+    </w:p>
+    <w:p>
+      <w:pPr>
+        <w:spacing w:after="0" w:before="80"/>
+      </w:pPr>
+    </w:p>
+    <w:p>
+      <w:pPr>
+        <w:spacing w:after="80" w:before="80"/>
+      </w:pPr>
+      <w:r>
+        <w:rPr>
+          <w:rFonts w:ascii="Arial" w:cs="Arial" w:eastAsia="Arial" w:hAnsi="Arial"/>
+          <w:sz w:val="24"/>
+          <w:szCs w:val="24"/>
+        </w:rPr>
+        <w:t xml:space="preserve">Options: </w:t>
+      </w:r>
+      <w:r>
+        <w:rPr>
+          <w:rFonts w:ascii="Courier New" w:cs="Courier New" w:eastAsia="Courier New" w:hAnsi="Courier New"/>
+          <w:color w:val="333333"/>
+          <w:sz w:val="22"/>
+          <w:szCs w:val="22"/>
+        </w:rPr>
+        <w:t xml:space="preserve">show:</w:t>
+      </w:r>
+      <w:r>
+        <w:rPr>
+          <w:rFonts w:ascii="Arial" w:cs="Arial" w:eastAsia="Arial" w:hAnsi="Arial"/>
+          <w:sz w:val="24"/>
+          <w:szCs w:val="24"/>
+        </w:rPr>
+        <w:t xml:space="preserve"> one show · </w:t>
+      </w:r>
+      <w:r>
+        <w:rPr>
+          <w:rFonts w:ascii="Courier New" w:cs="Courier New" w:eastAsia="Courier New" w:hAnsi="Courier New"/>
+          <w:color w:val="333333"/>
+          <w:sz w:val="22"/>
+          <w:szCs w:val="22"/>
+        </w:rPr>
+        <w:t xml:space="preserve">person:</w:t>
+      </w:r>
+      <w:r>
+        <w:rPr>
+          <w:rFonts w:ascii="Arial" w:cs="Arial" w:eastAsia="Arial" w:hAnsi="Arial"/>
+          <w:sz w:val="24"/>
+          <w:szCs w:val="24"/>
+        </w:rPr>
+        <w:t xml:space="preserve"> one person’s detail · </w:t>
+      </w:r>
+      <w:r>
+        <w:rPr>
+          <w:rFonts w:ascii="Courier New" w:cs="Courier New" w:eastAsia="Courier New" w:hAnsi="Courier New"/>
+          <w:color w:val="333333"/>
+          <w:sz w:val="22"/>
+          <w:szCs w:val="22"/>
+        </w:rPr>
+        <w:t xml:space="preserve">since:</w:t>
+      </w:r>
+      <w:r>
+        <w:rPr>
+          <w:rFonts w:ascii="Arial" w:cs="Arial" w:eastAsia="Arial" w:hAnsi="Arial"/>
+          <w:sz w:val="24"/>
+          <w:szCs w:val="24"/>
+        </w:rPr>
+        <w:t xml:space="preserve"> only shifts on/after a date. Custom-game covers are counted from when this feature shipped forward.</w:t>
+      </w:r>
+    </w:p>
+    <w:p>
+      <w:pPr>
+        <w:spacing w:after="0" w:before="120"/>
+      </w:pPr>
+    </w:p>
+    <w:p>
+      <w:pPr>
+        <w:pStyle w:val="Heading2"/>
+        <w:spacing w:after="60" w:before="200"/>
+      </w:pPr>
+      <w:r>
+        <w:rPr>
+          <w:rFonts w:ascii="Arial" w:cs="Arial" w:eastAsia="Arial" w:hAnsi="Arial"/>
+          <w:b/>
+          <w:bCs/>
+          <w:color w:val="333333"/>
+          <w:sz w:val="24"/>
+          <w:szCs w:val="24"/>
+        </w:rPr>
         <w:t xml:space="preserve">Channel Configuration</w:t>
       </w:r>
     </w:p>
@@ -4105,6 +4353,63 @@
                 <w:szCs w:val="22"/>
               </w:rPr>
               <w:t xml:space="preserve">Read-only list of outstanding shifts + games, with links</w:t>
+            </w:r>
+          </w:p>
+        </w:tc>
+      </w:tr>
+      <w:tr>
+        <w:tc>
+          <w:tcPr>
+            <w:tcW w:type="dxa" w:w="3200"/>
+            <w:tcBorders>
+              <w:top w:val="single" w:color="CCCCCC" w:sz="1"/>
+              <w:left w:val="single" w:color="CCCCCC" w:sz="1"/>
+              <w:bottom w:val="single" w:color="CCCCCC" w:sz="1"/>
+              <w:right w:val="single" w:color="CCCCCC" w:sz="1"/>
+            </w:tcBorders>
+            <w:tcMar>
+              <w:top w:type="dxa" w:w="60"/>
+              <w:left w:type="dxa" w:w="120"/>
+              <w:bottom w:type="dxa" w:w="60"/>
+              <w:right w:type="dxa" w:w="120"/>
+            </w:tcMar>
+          </w:tcPr>
+          <w:p>
+            <w:r>
+              <w:rPr>
+                <w:rFonts w:ascii="Courier New" w:cs="Courier New" w:eastAsia="Courier New" w:hAnsi="Courier New"/>
+                <w:color w:val="333333"/>
+                <w:sz w:val="21"/>
+                <w:szCs w:val="21"/>
+              </w:rPr>
+              <w:t xml:space="preserve">/coverage-stats</w:t>
+            </w:r>
+          </w:p>
+        </w:tc>
+        <w:tc>
+          <w:tcPr>
+            <w:tcW w:type="dxa" w:w="6160"/>
+            <w:tcBorders>
+              <w:top w:val="single" w:color="CCCCCC" w:sz="1"/>
+              <w:left w:val="single" w:color="CCCCCC" w:sz="1"/>
+              <w:bottom w:val="single" w:color="CCCCCC" w:sz="1"/>
+              <w:right w:val="single" w:color="CCCCCC" w:sz="1"/>
+            </w:tcBorders>
+            <w:tcMar>
+              <w:top w:type="dxa" w:w="60"/>
+              <w:left w:type="dxa" w:w="120"/>
+              <w:bottom w:type="dxa" w:w="60"/>
+              <w:right w:type="dxa" w:w="120"/>
+            </w:tcMar>
+          </w:tcPr>
+          <w:p>
+            <w:r>
+              <w:rPr>
+                <w:rFonts w:ascii="Arial" w:cs="Arial" w:eastAsia="Arial" w:hAnsi="Arial"/>
+                <w:sz w:val="22"/>
+                <w:szCs w:val="22"/>
+              </w:rPr>
+              <w:t xml:space="preserve">(Owner only) Running log of covers, requests, fill rate, timing</w:t>
             </w:r>
           </w:p>
         </w:tc>

</xml_diff>